<commit_message>
docs(informe): Anexo C con USER_ERRORS vacío y FN_FECHA_CORTE dentro de un SELECT (F5)
Suma las dos capturas nuevas de Gabriel: la grilla vacía de USER_ERRORS,
que completa la prueba integrada en C.1, y FN_FECHA_CORTE dentro de un
SELECT (14/02/2006 15:16:03, 183 y 182) en C.2. El Anexo C queda con las
35 capturas del grupo.

Signed-off-by: Sandy-Yera <sando.yera@gmail.com>
</commit_message>
<xml_diff>
--- a/entregables/003D-SAKILA-EP2-G01-INFORME.docx
+++ b/entregables/003D-SAKILA-EP2-G01-INFORME.docx
@@ -42006,7 +42006,7 @@
       <w:r>
         <w:drawing>
           <wp:inline distT="0" distB="0" distL="0" distR="0">
-            <wp:extent cx="5759999" cy="2309093"/>
+            <wp:extent cx="5543999" cy="926639"/>
             <wp:docPr id="1010" name="Imagen 10"/>
             <wp:cNvGraphicFramePr>
               <a:graphicFrameLocks noChangeAspect="1"/>
@@ -42027,7 +42027,7 @@
                   <pic:spPr>
                     <a:xfrm>
                       <a:off x="0" y="0"/>
-                      <a:ext cx="5759999" cy="2309093"/>
+                      <a:ext cx="5543999" cy="926639"/>
                     </a:xfrm>
                     <a:prstGeom prst="rect">
                       <a:avLst/>
@@ -42055,7 +42055,7 @@
           <w:sz w:val="18"/>
           <w:szCs w:val="18"/>
         </w:rPr>
-        <w:t xml:space="preserve">Figura C.3. Verificación de las cifras H1 a H10 en Oracle: filas 1 a 17, todas OK.</w:t>
+        <w:t xml:space="preserve">Figura C.3. USER_ERRORS no devuelve filas.</w:t>
       </w:r>
     </w:p>
     <w:p>
@@ -42068,7 +42068,7 @@
       <w:r>
         <w:drawing>
           <wp:inline distT="0" distB="0" distL="0" distR="0">
-            <wp:extent cx="5759999" cy="2054711"/>
+            <wp:extent cx="5759999" cy="2309093"/>
             <wp:docPr id="1011" name="Imagen 11"/>
             <wp:cNvGraphicFramePr>
               <a:graphicFrameLocks noChangeAspect="1"/>
@@ -42089,7 +42089,7 @@
                   <pic:spPr>
                     <a:xfrm>
                       <a:off x="0" y="0"/>
-                      <a:ext cx="5759999" cy="2054711"/>
+                      <a:ext cx="5759999" cy="2309093"/>
                     </a:xfrm>
                     <a:prstGeom prst="rect">
                       <a:avLst/>
@@ -42117,26 +42117,7 @@
           <w:sz w:val="18"/>
           <w:szCs w:val="18"/>
         </w:rPr>
-        <w:t xml:space="preserve">Figura C.4. Verificación de las cifras H1 a H10: filas 18 a 33, todas OK.</w:t>
-      </w:r>
-    </w:p>
-    <w:p>
-      <w:pPr>
-        <w:pStyle w:val="Heading3"/>
-        <w:keepNext w:val="1"/>
-        <w:spacing w:after="100" w:before="180" w:lineRule="auto"/>
-        <w:rPr/>
-      </w:pPr>
-      <w:r>
-        <w:rPr>
-          <w:rFonts w:ascii="Calibri" w:cs="Calibri" w:eastAsia="Calibri" w:hAnsi="Calibri"/>
-          <w:b w:val="1"/>
-          <w:bCs w:val="1"/>
-          <w:color w:val="2e5496"/>
-          <w:sz w:val="23"/>
-          <w:szCs w:val="23"/>
-        </w:rPr>
-        <w:t xml:space="preserve">C.2 Gabriel: procedimientos, funciones y PKG_RESPONSABILIDAD_CLIENTE</w:t>
+        <w:t xml:space="preserve">Figura C.4. Verificación de las cifras H1 a H10 en Oracle: filas 1 a 17, todas OK.</w:t>
       </w:r>
     </w:p>
     <w:p>
@@ -42149,7 +42130,7 @@
       <w:r>
         <w:drawing>
           <wp:inline distT="0" distB="0" distL="0" distR="0">
-            <wp:extent cx="3611520" cy="950400"/>
+            <wp:extent cx="5759999" cy="2054711"/>
             <wp:docPr id="1012" name="Imagen 12"/>
             <wp:cNvGraphicFramePr>
               <a:graphicFrameLocks noChangeAspect="1"/>
@@ -42170,7 +42151,7 @@
                   <pic:spPr>
                     <a:xfrm>
                       <a:off x="0" y="0"/>
-                      <a:ext cx="3611520" cy="950400"/>
+                      <a:ext cx="5759999" cy="2054711"/>
                     </a:xfrm>
                     <a:prstGeom prst="rect">
                       <a:avLst/>
@@ -42198,7 +42179,26 @@
           <w:sz w:val="18"/>
           <w:szCs w:val="18"/>
         </w:rPr>
-        <w:t xml:space="preserve">Figura C.5. FN_FECHA_CORTE dentro de un bloque PL/SQL: corte el 14/02/2006 15:16:03, 182 arriendos vigentes y 1 vencido.</w:t>
+        <w:t xml:space="preserve">Figura C.5. Verificación de las cifras H1 a H10: filas 18 a 33, todas OK.</w:t>
+      </w:r>
+    </w:p>
+    <w:p>
+      <w:pPr>
+        <w:pStyle w:val="Heading3"/>
+        <w:keepNext w:val="1"/>
+        <w:spacing w:after="100" w:before="180" w:lineRule="auto"/>
+        <w:rPr/>
+      </w:pPr>
+      <w:r>
+        <w:rPr>
+          <w:rFonts w:ascii="Calibri" w:cs="Calibri" w:eastAsia="Calibri" w:hAnsi="Calibri"/>
+          <w:b w:val="1"/>
+          <w:bCs w:val="1"/>
+          <w:color w:val="2e5496"/>
+          <w:sz w:val="23"/>
+          <w:szCs w:val="23"/>
+        </w:rPr>
+        <w:t xml:space="preserve">C.2 Gabriel: procedimientos, funciones y PKG_RESPONSABILIDAD_CLIENTE</w:t>
       </w:r>
     </w:p>
     <w:p>
@@ -42211,7 +42211,7 @@
       <w:r>
         <w:drawing>
           <wp:inline distT="0" distB="0" distL="0" distR="0">
-            <wp:extent cx="3682799" cy="530639"/>
+            <wp:extent cx="3611520" cy="950400"/>
             <wp:docPr id="1013" name="Imagen 13"/>
             <wp:cNvGraphicFramePr>
               <a:graphicFrameLocks noChangeAspect="1"/>
@@ -42232,7 +42232,7 @@
                   <pic:spPr>
                     <a:xfrm>
                       <a:off x="0" y="0"/>
-                      <a:ext cx="3682799" cy="530639"/>
+                      <a:ext cx="3611520" cy="950400"/>
                     </a:xfrm>
                     <a:prstGeom prst="rect">
                       <a:avLst/>
@@ -42260,7 +42260,7 @@
           <w:sz w:val="18"/>
           <w:szCs w:val="18"/>
         </w:rPr>
-        <w:t xml:space="preserve">Figura C.6. FN_PORCENTAJE_EN_PLAZO sobre los 599 clientes: mínimo 16,7, mediana 53,8 y máximo 88,9.</w:t>
+        <w:t xml:space="preserve">Figura C.6. FN_FECHA_CORTE dentro de un bloque PL/SQL: corte el 14/02/2006 15:16:03, 182 arriendos vigentes y 1 vencido.</w:t>
       </w:r>
     </w:p>
     <w:p>
@@ -42273,7 +42273,7 @@
       <w:r>
         <w:drawing>
           <wp:inline distT="0" distB="0" distL="0" distR="0">
-            <wp:extent cx="4767839" cy="1457279"/>
+            <wp:extent cx="5543999" cy="578159"/>
             <wp:docPr id="1014" name="Imagen 14"/>
             <wp:cNvGraphicFramePr>
               <a:graphicFrameLocks noChangeAspect="1"/>
@@ -42294,7 +42294,7 @@
                   <pic:spPr>
                     <a:xfrm>
                       <a:off x="0" y="0"/>
-                      <a:ext cx="4767839" cy="1457279"/>
+                      <a:ext cx="5543999" cy="578159"/>
                     </a:xfrm>
                     <a:prstGeom prst="rect">
                       <a:avLst/>
@@ -42322,7 +42322,7 @@
           <w:sz w:val="18"/>
           <w:szCs w:val="18"/>
         </w:rPr>
-        <w:t xml:space="preserve">Figura C.7. FN_PORCENTAJE_EN_PLAZO dentro de un SELECT: los 5 clientes más puntuales.</w:t>
+        <w:t xml:space="preserve">Figura C.7. FN_FECHA_CORTE dentro de un SELECT: 183 arriendos sin devolver, 182 de ellos hechos en el último instante del dataset.</w:t>
       </w:r>
     </w:p>
     <w:p>
@@ -42335,7 +42335,7 @@
       <w:r>
         <w:drawing>
           <wp:inline distT="0" distB="0" distL="0" distR="0">
-            <wp:extent cx="4205519" cy="966239"/>
+            <wp:extent cx="3682799" cy="530639"/>
             <wp:docPr id="1015" name="Imagen 15"/>
             <wp:cNvGraphicFramePr>
               <a:graphicFrameLocks noChangeAspect="1"/>
@@ -42356,7 +42356,7 @@
                   <pic:spPr>
                     <a:xfrm>
                       <a:off x="0" y="0"/>
-                      <a:ext cx="4205519" cy="966239"/>
+                      <a:ext cx="3682799" cy="530639"/>
                     </a:xfrm>
                     <a:prstGeom prst="rect">
                       <a:avLst/>
@@ -42384,7 +42384,7 @@
           <w:sz w:val="18"/>
           <w:szCs w:val="18"/>
         </w:rPr>
-        <w:t xml:space="preserve">Figura C.8. FN_PORCENTAJE_EN_PLAZO dentro de un bloque PL/SQL: promedio por tienda.</w:t>
+        <w:t xml:space="preserve">Figura C.8. FN_PORCENTAJE_EN_PLAZO sobre los 599 clientes: mínimo 16,7, mediana 53,8 y máximo 88,9.</w:t>
       </w:r>
     </w:p>
     <w:p>
@@ -42397,7 +42397,7 @@
       <w:r>
         <w:drawing>
           <wp:inline distT="0" distB="0" distL="0" distR="0">
-            <wp:extent cx="5512319" cy="1750319"/>
+            <wp:extent cx="4767839" cy="1457279"/>
             <wp:docPr id="1016" name="Imagen 16"/>
             <wp:cNvGraphicFramePr>
               <a:graphicFrameLocks noChangeAspect="1"/>
@@ -42418,7 +42418,7 @@
                   <pic:spPr>
                     <a:xfrm>
                       <a:off x="0" y="0"/>
-                      <a:ext cx="5512319" cy="1750319"/>
+                      <a:ext cx="4767839" cy="1457279"/>
                     </a:xfrm>
                     <a:prstGeom prst="rect">
                       <a:avLst/>
@@ -42446,7 +42446,7 @@
           <w:sz w:val="18"/>
           <w:szCs w:val="18"/>
         </w:rPr>
-        <w:t xml:space="preserve">Figura C.9. SP_MEDALLA_CLIENTE: medalla calculada, medalla guardada y cliente inexistente (ORA-20101).</w:t>
+        <w:t xml:space="preserve">Figura C.9. FN_PORCENTAJE_EN_PLAZO dentro de un SELECT: los 5 clientes más puntuales.</w:t>
       </w:r>
     </w:p>
     <w:p>
@@ -42459,7 +42459,7 @@
       <w:r>
         <w:drawing>
           <wp:inline distT="0" distB="0" distL="0" distR="0">
-            <wp:extent cx="2748240" cy="1069200"/>
+            <wp:extent cx="4205519" cy="966239"/>
             <wp:docPr id="1017" name="Imagen 17"/>
             <wp:cNvGraphicFramePr>
               <a:graphicFrameLocks noChangeAspect="1"/>
@@ -42480,7 +42480,7 @@
                   <pic:spPr>
                     <a:xfrm>
                       <a:off x="0" y="0"/>
-                      <a:ext cx="2748240" cy="1069200"/>
+                      <a:ext cx="4205519" cy="966239"/>
                     </a:xfrm>
                     <a:prstGeom prst="rect">
                       <a:avLst/>
@@ -42508,7 +42508,7 @@
           <w:sz w:val="18"/>
           <w:szCs w:val="18"/>
         </w:rPr>
-        <w:t xml:space="preserve">Figura C.10. FN_PUEDE_ARRENDAR dentro de un SELECT: 583 clientes SI, 15 INACTIVO y 1 ATRASO.</w:t>
+        <w:t xml:space="preserve">Figura C.10. FN_PORCENTAJE_EN_PLAZO dentro de un bloque PL/SQL: promedio por tienda.</w:t>
       </w:r>
     </w:p>
     <w:p>
@@ -42521,7 +42521,7 @@
       <w:r>
         <w:drawing>
           <wp:inline distT="0" distB="0" distL="0" distR="0">
-            <wp:extent cx="5243039" cy="1679039"/>
+            <wp:extent cx="5512319" cy="1750319"/>
             <wp:docPr id="1018" name="Imagen 18"/>
             <wp:cNvGraphicFramePr>
               <a:graphicFrameLocks noChangeAspect="1"/>
@@ -42542,7 +42542,7 @@
                   <pic:spPr>
                     <a:xfrm>
                       <a:off x="0" y="0"/>
-                      <a:ext cx="5243039" cy="1679039"/>
+                      <a:ext cx="5512319" cy="1750319"/>
                     </a:xfrm>
                     <a:prstGeom prst="rect">
                       <a:avLst/>
@@ -42570,7 +42570,7 @@
           <w:sz w:val="18"/>
           <w:szCs w:val="18"/>
         </w:rPr>
-        <w:t xml:space="preserve">Figura C.11. FN_PUEDE_ARRENDAR: límite de copias de un cliente BRONCE y cliente inexistente (ORA-20102).</w:t>
+        <w:t xml:space="preserve">Figura C.11. SP_MEDALLA_CLIENTE: medalla calculada, medalla guardada y cliente inexistente (ORA-20101).</w:t>
       </w:r>
     </w:p>
     <w:p>
@@ -42583,7 +42583,7 @@
       <w:r>
         <w:drawing>
           <wp:inline distT="0" distB="0" distL="0" distR="0">
-            <wp:extent cx="4118400" cy="625680"/>
+            <wp:extent cx="2748240" cy="1069200"/>
             <wp:docPr id="1019" name="Imagen 19"/>
             <wp:cNvGraphicFramePr>
               <a:graphicFrameLocks noChangeAspect="1"/>
@@ -42604,7 +42604,7 @@
                   <pic:spPr>
                     <a:xfrm>
                       <a:off x="0" y="0"/>
-                      <a:ext cx="4118400" cy="625680"/>
+                      <a:ext cx="2748240" cy="1069200"/>
                     </a:xfrm>
                     <a:prstGeom prst="rect">
                       <a:avLst/>
@@ -42632,7 +42632,7 @@
           <w:sz w:val="18"/>
           <w:szCs w:val="18"/>
         </w:rPr>
-        <w:t xml:space="preserve">Figura C.12. SP_ACTUALIZA_MEDALLAS procesa los 599 clientes.</w:t>
+        <w:t xml:space="preserve">Figura C.12. FN_PUEDE_ARRENDAR dentro de un SELECT: 583 clientes SI, 15 INACTIVO y 1 ATRASO.</w:t>
       </w:r>
     </w:p>
     <w:p>
@@ -42645,7 +42645,7 @@
       <w:r>
         <w:drawing>
           <wp:inline distT="0" distB="0" distL="0" distR="0">
-            <wp:extent cx="4158000" cy="1053360"/>
+            <wp:extent cx="5243039" cy="1679039"/>
             <wp:docPr id="1020" name="Imagen 20"/>
             <wp:cNvGraphicFramePr>
               <a:graphicFrameLocks noChangeAspect="1"/>
@@ -42666,7 +42666,7 @@
                   <pic:spPr>
                     <a:xfrm>
                       <a:off x="0" y="0"/>
-                      <a:ext cx="4158000" cy="1053360"/>
+                      <a:ext cx="5243039" cy="1679039"/>
                     </a:xfrm>
                     <a:prstGeom prst="rect">
                       <a:avLst/>
@@ -42694,7 +42694,7 @@
           <w:sz w:val="18"/>
           <w:szCs w:val="18"/>
         </w:rPr>
-        <w:t xml:space="preserve">Figura C.13. Medallas resultantes: 78 ORO, 347 PLATA y 174 BRONCE.</w:t>
+        <w:t xml:space="preserve">Figura C.13. FN_PUEDE_ARRENDAR: límite de copias de un cliente BRONCE y cliente inexistente (ORA-20102).</w:t>
       </w:r>
     </w:p>
     <w:p>
@@ -42707,7 +42707,7 @@
       <w:r>
         <w:drawing>
           <wp:inline distT="0" distB="0" distL="0" distR="0">
-            <wp:extent cx="5504400" cy="1576080"/>
+            <wp:extent cx="4118400" cy="625680"/>
             <wp:docPr id="1021" name="Imagen 21"/>
             <wp:cNvGraphicFramePr>
               <a:graphicFrameLocks noChangeAspect="1"/>
@@ -42728,7 +42728,7 @@
                   <pic:spPr>
                     <a:xfrm>
                       <a:off x="0" y="0"/>
-                      <a:ext cx="5504400" cy="1576080"/>
+                      <a:ext cx="4118400" cy="625680"/>
                     </a:xfrm>
                     <a:prstGeom prst="rect">
                       <a:avLst/>
@@ -42756,7 +42756,7 @@
           <w:sz w:val="18"/>
           <w:szCs w:val="18"/>
         </w:rPr>
-        <w:t xml:space="preserve">Figura C.14. PKG_RESPONSABILIDAD_CLIENTE: FN_MEDALLA y FN_LIMITE_ARRIENDOS dentro de un SELECT.</w:t>
+        <w:t xml:space="preserve">Figura C.14. SP_ACTUALIZA_MEDALLAS procesa los 599 clientes.</w:t>
       </w:r>
     </w:p>
     <w:p>
@@ -42769,7 +42769,7 @@
       <w:r>
         <w:drawing>
           <wp:inline distT="0" distB="0" distL="0" distR="0">
-            <wp:extent cx="3864960" cy="2526480"/>
+            <wp:extent cx="4158000" cy="1053360"/>
             <wp:docPr id="1022" name="Imagen 22"/>
             <wp:cNvGraphicFramePr>
               <a:graphicFrameLocks noChangeAspect="1"/>
@@ -42790,7 +42790,7 @@
                   <pic:spPr>
                     <a:xfrm>
                       <a:off x="0" y="0"/>
-                      <a:ext cx="3864960" cy="2526480"/>
+                      <a:ext cx="4158000" cy="1053360"/>
                     </a:xfrm>
                     <a:prstGeom prst="rect">
                       <a:avLst/>
@@ -42818,7 +42818,7 @@
           <w:sz w:val="18"/>
           <w:szCs w:val="18"/>
         </w:rPr>
-        <w:t xml:space="preserve">Figura C.15. PR_PROCESO_MENSUAL: reporte de la Tienda 1.</w:t>
+        <w:t xml:space="preserve">Figura C.15. Medallas resultantes: 78 ORO, 347 PLATA y 174 BRONCE.</w:t>
       </w:r>
     </w:p>
     <w:p>
@@ -42831,7 +42831,7 @@
       <w:r>
         <w:drawing>
           <wp:inline distT="0" distB="0" distL="0" distR="0">
-            <wp:extent cx="3817439" cy="2526479"/>
+            <wp:extent cx="5504400" cy="1576080"/>
             <wp:docPr id="1023" name="Imagen 23"/>
             <wp:cNvGraphicFramePr>
               <a:graphicFrameLocks noChangeAspect="1"/>
@@ -42852,7 +42852,7 @@
                   <pic:spPr>
                     <a:xfrm>
                       <a:off x="0" y="0"/>
-                      <a:ext cx="3817439" cy="2526479"/>
+                      <a:ext cx="5504400" cy="1576080"/>
                     </a:xfrm>
                     <a:prstGeom prst="rect">
                       <a:avLst/>
@@ -42880,7 +42880,7 @@
           <w:sz w:val="18"/>
           <w:szCs w:val="18"/>
         </w:rPr>
-        <w:t xml:space="preserve">Figura C.16. PR_PROCESO_MENSUAL: reporte de la Tienda 2.</w:t>
+        <w:t xml:space="preserve">Figura C.16. PKG_RESPONSABILIDAD_CLIENTE: FN_MEDALLA y FN_LIMITE_ARRIENDOS dentro de un SELECT.</w:t>
       </w:r>
     </w:p>
     <w:p>
@@ -42893,7 +42893,7 @@
       <w:r>
         <w:drawing>
           <wp:inline distT="0" distB="0" distL="0" distR="0">
-            <wp:extent cx="5759999" cy="1219163"/>
+            <wp:extent cx="3864960" cy="2526480"/>
             <wp:docPr id="1024" name="Imagen 24"/>
             <wp:cNvGraphicFramePr>
               <a:graphicFrameLocks noChangeAspect="1"/>
@@ -42914,7 +42914,7 @@
                   <pic:spPr>
                     <a:xfrm>
                       <a:off x="0" y="0"/>
-                      <a:ext cx="5759999" cy="1219163"/>
+                      <a:ext cx="3864960" cy="2526480"/>
                     </a:xfrm>
                     <a:prstGeom prst="rect">
                       <a:avLst/>
@@ -42942,26 +42942,7 @@
           <w:sz w:val="18"/>
           <w:szCs w:val="18"/>
         </w:rPr>
-        <w:t xml:space="preserve">Figura C.17. Un miembro privado no se ve desde fuera del package (PLS-00302).</w:t>
-      </w:r>
-    </w:p>
-    <w:p>
-      <w:pPr>
-        <w:pStyle w:val="Heading3"/>
-        <w:keepNext w:val="1"/>
-        <w:spacing w:after="100" w:before="180" w:lineRule="auto"/>
-        <w:rPr/>
-      </w:pPr>
-      <w:r>
-        <w:rPr>
-          <w:rFonts w:ascii="Calibri" w:cs="Calibri" w:eastAsia="Calibri" w:hAnsi="Calibri"/>
-          <w:b w:val="1"/>
-          <w:bCs w:val="1"/>
-          <w:color w:val="2e5496"/>
-          <w:sz w:val="23"/>
-          <w:szCs w:val="23"/>
-        </w:rPr>
-        <w:t xml:space="preserve">C.3 Simón: funciones y PKG_COBRANZA_INVENTARIO</w:t>
+        <w:t xml:space="preserve">Figura C.17. PR_PROCESO_MENSUAL: reporte de la Tienda 1.</w:t>
       </w:r>
     </w:p>
     <w:p>
@@ -42974,7 +42955,7 @@
       <w:r>
         <w:drawing>
           <wp:inline distT="0" distB="0" distL="0" distR="0">
-            <wp:extent cx="4324319" cy="554399"/>
+            <wp:extent cx="3817439" cy="2526479"/>
             <wp:docPr id="1025" name="Imagen 25"/>
             <wp:cNvGraphicFramePr>
               <a:graphicFrameLocks noChangeAspect="1"/>
@@ -42995,7 +42976,7 @@
                   <pic:spPr>
                     <a:xfrm>
                       <a:off x="0" y="0"/>
-                      <a:ext cx="4324319" cy="554399"/>
+                      <a:ext cx="3817439" cy="2526479"/>
                     </a:xfrm>
                     <a:prstGeom prst="rect">
                       <a:avLst/>
@@ -43023,7 +43004,7 @@
           <w:sz w:val="18"/>
           <w:szCs w:val="18"/>
         </w:rPr>
-        <w:t xml:space="preserve">Figura C.18. FN_MULTA_CON_TOPE dentro de un SELECT: la copia de ACADEMY DINOSAUR paga 20,99 USD.</w:t>
+        <w:t xml:space="preserve">Figura C.18. PR_PROCESO_MENSUAL: reporte de la Tienda 2.</w:t>
       </w:r>
     </w:p>
     <w:p>
@@ -43036,7 +43017,7 @@
       <w:r>
         <w:drawing>
           <wp:inline distT="0" distB="0" distL="0" distR="0">
-            <wp:extent cx="5559840" cy="950400"/>
+            <wp:extent cx="5759999" cy="1219163"/>
             <wp:docPr id="1026" name="Imagen 26"/>
             <wp:cNvGraphicFramePr>
               <a:graphicFrameLocks noChangeAspect="1"/>
@@ -43057,7 +43038,7 @@
                   <pic:spPr>
                     <a:xfrm>
                       <a:off x="0" y="0"/>
-                      <a:ext cx="5559840" cy="950400"/>
+                      <a:ext cx="5759999" cy="1219163"/>
                     </a:xfrm>
                     <a:prstGeom prst="rect">
                       <a:avLst/>
@@ -43085,7 +43066,26 @@
           <w:sz w:val="18"/>
           <w:szCs w:val="18"/>
         </w:rPr>
-        <w:t xml:space="preserve">Figura C.19. FN_MULTA_CON_TOPE dentro de un bloque PL/SQL y copia inexistente (ORA-20201).</w:t>
+        <w:t xml:space="preserve">Figura C.19. Un miembro privado no se ve desde fuera del package (PLS-00302).</w:t>
+      </w:r>
+    </w:p>
+    <w:p>
+      <w:pPr>
+        <w:pStyle w:val="Heading3"/>
+        <w:keepNext w:val="1"/>
+        <w:spacing w:after="100" w:before="180" w:lineRule="auto"/>
+        <w:rPr/>
+      </w:pPr>
+      <w:r>
+        <w:rPr>
+          <w:rFonts w:ascii="Calibri" w:cs="Calibri" w:eastAsia="Calibri" w:hAnsi="Calibri"/>
+          <w:b w:val="1"/>
+          <w:bCs w:val="1"/>
+          <w:color w:val="2e5496"/>
+          <w:sz w:val="23"/>
+          <w:szCs w:val="23"/>
+        </w:rPr>
+        <w:t xml:space="preserve">C.3 Simón: funciones y PKG_COBRANZA_INVENTARIO</w:t>
       </w:r>
     </w:p>
     <w:p>
@@ -43098,7 +43098,7 @@
       <w:r>
         <w:drawing>
           <wp:inline distT="0" distB="0" distL="0" distR="0">
-            <wp:extent cx="3730320" cy="760320"/>
+            <wp:extent cx="4324319" cy="554399"/>
             <wp:docPr id="1027" name="Imagen 27"/>
             <wp:cNvGraphicFramePr>
               <a:graphicFrameLocks noChangeAspect="1"/>
@@ -43119,7 +43119,7 @@
                   <pic:spPr>
                     <a:xfrm>
                       <a:off x="0" y="0"/>
-                      <a:ext cx="3730320" cy="760320"/>
+                      <a:ext cx="4324319" cy="554399"/>
                     </a:xfrm>
                     <a:prstGeom prst="rect">
                       <a:avLst/>
@@ -43147,7 +43147,7 @@
           <w:sz w:val="18"/>
           <w:szCs w:val="18"/>
         </w:rPr>
-        <w:t xml:space="preserve">Figura C.20. FN_RENTABILIDAD_COPIA dentro de un SELECT: 3.331 copias no recuperan su costo, con una brecha de 35.009 USD.</w:t>
+        <w:t xml:space="preserve">Figura C.20. FN_MULTA_CON_TOPE dentro de un SELECT: la copia de ACADEMY DINOSAUR paga 20,99 USD.</w:t>
       </w:r>
     </w:p>
     <w:p>
@@ -43160,7 +43160,7 @@
       <w:r>
         <w:drawing>
           <wp:inline distT="0" distB="0" distL="0" distR="0">
-            <wp:extent cx="5472720" cy="1584000"/>
+            <wp:extent cx="5559840" cy="950400"/>
             <wp:docPr id="1028" name="Imagen 28"/>
             <wp:cNvGraphicFramePr>
               <a:graphicFrameLocks noChangeAspect="1"/>
@@ -43181,7 +43181,7 @@
                   <pic:spPr>
                     <a:xfrm>
                       <a:off x="0" y="0"/>
-                      <a:ext cx="5472720" cy="1584000"/>
+                      <a:ext cx="5559840" cy="950400"/>
                     </a:xfrm>
                     <a:prstGeom prst="rect">
                       <a:avLst/>
@@ -43209,7 +43209,7 @@
           <w:sz w:val="18"/>
           <w:szCs w:val="18"/>
         </w:rPr>
-        <w:t xml:space="preserve">Figura C.21. FN_RENTABILIDAD_COPIA: las 5 copias más lejos de pagarse solas.</w:t>
+        <w:t xml:space="preserve">Figura C.21. FN_MULTA_CON_TOPE dentro de un bloque PL/SQL y copia inexistente (ORA-20201).</w:t>
       </w:r>
     </w:p>
     <w:p>
@@ -43222,7 +43222,7 @@
       <w:r>
         <w:drawing>
           <wp:inline distT="0" distB="0" distL="0" distR="0">
-            <wp:extent cx="2376000" cy="594000"/>
+            <wp:extent cx="3730320" cy="760320"/>
             <wp:docPr id="1029" name="Imagen 29"/>
             <wp:cNvGraphicFramePr>
               <a:graphicFrameLocks noChangeAspect="1"/>
@@ -43243,7 +43243,7 @@
                   <pic:spPr>
                     <a:xfrm>
                       <a:off x="0" y="0"/>
-                      <a:ext cx="2376000" cy="594000"/>
+                      <a:ext cx="3730320" cy="760320"/>
                     </a:xfrm>
                     <a:prstGeom prst="rect">
                       <a:avLst/>
@@ -43271,7 +43271,7 @@
           <w:sz w:val="18"/>
           <w:szCs w:val="18"/>
         </w:rPr>
-        <w:t xml:space="preserve">Figura C.22. FN_CAPITAL_EN_RIESGO dentro de un SELECT: 20,99 USD.</w:t>
+        <w:t xml:space="preserve">Figura C.22. FN_RENTABILIDAD_COPIA dentro de un SELECT: 3.331 copias no recuperan su costo, con una brecha de 35.009 USD.</w:t>
       </w:r>
     </w:p>
     <w:p>
@@ -43284,7 +43284,7 @@
       <w:r>
         <w:drawing>
           <wp:inline distT="0" distB="0" distL="0" distR="0">
-            <wp:extent cx="5759999" cy="3588974"/>
+            <wp:extent cx="5472720" cy="1584000"/>
             <wp:docPr id="1030" name="Imagen 30"/>
             <wp:cNvGraphicFramePr>
               <a:graphicFrameLocks noChangeAspect="1"/>
@@ -43305,7 +43305,7 @@
                   <pic:spPr>
                     <a:xfrm>
                       <a:off x="0" y="0"/>
-                      <a:ext cx="5759999" cy="3588974"/>
+                      <a:ext cx="5472720" cy="1584000"/>
                     </a:xfrm>
                     <a:prstGeom prst="rect">
                       <a:avLst/>
@@ -43333,7 +43333,7 @@
           <w:sz w:val="18"/>
           <w:szCs w:val="18"/>
         </w:rPr>
-        <w:t xml:space="preserve">Figura C.23. PR_REPORTE_FUGA: copias fuera por banda de atraso en ambas tiendas.</w:t>
+        <w:t xml:space="preserve">Figura C.23. FN_RENTABILIDAD_COPIA: las 5 copias más lejos de pagarse solas.</w:t>
       </w:r>
     </w:p>
     <w:p>
@@ -43346,7 +43346,7 @@
       <w:r>
         <w:drawing>
           <wp:inline distT="0" distB="0" distL="0" distR="0">
-            <wp:extent cx="4300560" cy="3706560"/>
+            <wp:extent cx="2376000" cy="594000"/>
             <wp:docPr id="1031" name="Imagen 31"/>
             <wp:cNvGraphicFramePr>
               <a:graphicFrameLocks noChangeAspect="1"/>
@@ -43367,7 +43367,7 @@
                   <pic:spPr>
                     <a:xfrm>
                       <a:off x="0" y="0"/>
-                      <a:ext cx="4300560" cy="3706560"/>
+                      <a:ext cx="2376000" cy="594000"/>
                     </a:xfrm>
                     <a:prstGeom prst="rect">
                       <a:avLst/>
@@ -43395,7 +43395,7 @@
           <w:sz w:val="18"/>
           <w:szCs w:val="18"/>
         </w:rPr>
-        <w:t xml:space="preserve">Figura C.24. PR_REPORTE_RENTABILIDAD de cada tienda.</w:t>
+        <w:t xml:space="preserve">Figura C.24. FN_CAPITAL_EN_RIESGO dentro de un SELECT: 20,99 USD.</w:t>
       </w:r>
     </w:p>
     <w:p>
@@ -43408,7 +43408,7 @@
       <w:r>
         <w:drawing>
           <wp:inline distT="0" distB="0" distL="0" distR="0">
-            <wp:extent cx="5759999" cy="4012749"/>
+            <wp:extent cx="5759999" cy="3588974"/>
             <wp:docPr id="1032" name="Imagen 32"/>
             <wp:cNvGraphicFramePr>
               <a:graphicFrameLocks noChangeAspect="1"/>
@@ -43429,7 +43429,7 @@
                   <pic:spPr>
                     <a:xfrm>
                       <a:off x="0" y="0"/>
-                      <a:ext cx="5759999" cy="4012749"/>
+                      <a:ext cx="5759999" cy="3588974"/>
                     </a:xfrm>
                     <a:prstGeom prst="rect">
                       <a:avLst/>
@@ -43457,7 +43457,7 @@
           <w:sz w:val="18"/>
           <w:szCs w:val="18"/>
         </w:rPr>
-        <w:t xml:space="preserve">Figura C.25. PR_SIMULA_PLAZO con 1, 2 y 3 días extra de plazo.</w:t>
+        <w:t xml:space="preserve">Figura C.25. PR_REPORTE_FUGA: copias fuera por banda de atraso en ambas tiendas.</w:t>
       </w:r>
     </w:p>
     <w:p>
@@ -43470,7 +43470,7 @@
       <w:r>
         <w:drawing>
           <wp:inline distT="0" distB="0" distL="0" distR="0">
-            <wp:extent cx="5759999" cy="3578897"/>
+            <wp:extent cx="4300560" cy="3706560"/>
             <wp:docPr id="1033" name="Imagen 33"/>
             <wp:cNvGraphicFramePr>
               <a:graphicFrameLocks noChangeAspect="1"/>
@@ -43491,7 +43491,7 @@
                   <pic:spPr>
                     <a:xfrm>
                       <a:off x="0" y="0"/>
-                      <a:ext cx="5759999" cy="3578897"/>
+                      <a:ext cx="4300560" cy="3706560"/>
                     </a:xfrm>
                     <a:prstGeom prst="rect">
                       <a:avLst/>
@@ -43519,7 +43519,7 @@
           <w:sz w:val="18"/>
           <w:szCs w:val="18"/>
         </w:rPr>
-        <w:t xml:space="preserve">Figura C.26. PR_PROCESO_MENSUAL: reporte de fuga.</w:t>
+        <w:t xml:space="preserve">Figura C.26. PR_REPORTE_RENTABILIDAD de cada tienda.</w:t>
       </w:r>
     </w:p>
     <w:p>
@@ -43532,7 +43532,7 @@
       <w:r>
         <w:drawing>
           <wp:inline distT="0" distB="0" distL="0" distR="0">
-            <wp:extent cx="4221360" cy="2874960"/>
+            <wp:extent cx="5759999" cy="4012749"/>
             <wp:docPr id="1034" name="Imagen 34"/>
             <wp:cNvGraphicFramePr>
               <a:graphicFrameLocks noChangeAspect="1"/>
@@ -43553,7 +43553,7 @@
                   <pic:spPr>
                     <a:xfrm>
                       <a:off x="0" y="0"/>
-                      <a:ext cx="4221360" cy="2874960"/>
+                      <a:ext cx="5759999" cy="4012749"/>
                     </a:xfrm>
                     <a:prstGeom prst="rect">
                       <a:avLst/>
@@ -43581,7 +43581,7 @@
           <w:sz w:val="18"/>
           <w:szCs w:val="18"/>
         </w:rPr>
-        <w:t xml:space="preserve">Figura C.27. PR_PROCESO_MENSUAL: reporte de rentabilidad.</w:t>
+        <w:t xml:space="preserve">Figura C.27. PR_SIMULA_PLAZO con 1, 2 y 3 días extra de plazo.</w:t>
       </w:r>
     </w:p>
     <w:p>
@@ -43594,7 +43594,7 @@
       <w:r>
         <w:drawing>
           <wp:inline distT="0" distB="0" distL="0" distR="0">
-            <wp:extent cx="5759999" cy="2071443"/>
+            <wp:extent cx="5759999" cy="3578897"/>
             <wp:docPr id="1035" name="Imagen 35"/>
             <wp:cNvGraphicFramePr>
               <a:graphicFrameLocks noChangeAspect="1"/>
@@ -43615,7 +43615,7 @@
                   <pic:spPr>
                     <a:xfrm>
                       <a:off x="0" y="0"/>
-                      <a:ext cx="5759999" cy="2071443"/>
+                      <a:ext cx="5759999" cy="3578897"/>
                     </a:xfrm>
                     <a:prstGeom prst="rect">
                       <a:avLst/>
@@ -43643,26 +43643,7 @@
           <w:sz w:val="18"/>
           <w:szCs w:val="18"/>
         </w:rPr>
-        <w:t xml:space="preserve">Figura C.28. Error controlado de PR_SIMULA_PLAZO (ORA-20203) y miembro privado no visible (PLS-00302).</w:t>
-      </w:r>
-    </w:p>
-    <w:p>
-      <w:pPr>
-        <w:pStyle w:val="Heading3"/>
-        <w:keepNext w:val="1"/>
-        <w:spacing w:after="100" w:before="180" w:lineRule="auto"/>
-        <w:rPr/>
-      </w:pPr>
-      <w:r>
-        <w:rPr>
-          <w:rFonts w:ascii="Calibri" w:cs="Calibri" w:eastAsia="Calibri" w:hAnsi="Calibri"/>
-          <w:b w:val="1"/>
-          <w:bCs w:val="1"/>
-          <w:color w:val="2e5496"/>
-          <w:sz w:val="23"/>
-          <w:szCs w:val="23"/>
-        </w:rPr>
-        <w:t xml:space="preserve">C.4 Catalina: triggers</w:t>
+        <w:t xml:space="preserve">Figura C.28. PR_PROCESO_MENSUAL: reporte de fuga.</w:t>
       </w:r>
     </w:p>
     <w:p>
@@ -43675,7 +43656,7 @@
       <w:r>
         <w:drawing>
           <wp:inline distT="0" distB="0" distL="0" distR="0">
-            <wp:extent cx="5759999" cy="3194999"/>
+            <wp:extent cx="4221360" cy="2874960"/>
             <wp:docPr id="1036" name="Imagen 36"/>
             <wp:cNvGraphicFramePr>
               <a:graphicFrameLocks noChangeAspect="1"/>
@@ -43696,7 +43677,7 @@
                   <pic:spPr>
                     <a:xfrm>
                       <a:off x="0" y="0"/>
-                      <a:ext cx="5759999" cy="3194999"/>
+                      <a:ext cx="4221360" cy="2874960"/>
                     </a:xfrm>
                     <a:prstGeom prst="rect">
                       <a:avLst/>
@@ -43724,7 +43705,7 @@
           <w:sz w:val="18"/>
           <w:szCs w:val="18"/>
         </w:rPr>
-        <w:t xml:space="preserve">Figura C.29. C1 TRG_VALIDA_PAGO_RENTAL: el pago sin arriendo se rechaza con ORA-20301 y el pago con arriendo entra; tras el ROLLBACK quedan 16.049 pagos.</w:t>
+        <w:t xml:space="preserve">Figura C.29. PR_PROCESO_MENSUAL: reporte de rentabilidad.</w:t>
       </w:r>
     </w:p>
     <w:p>
@@ -43737,7 +43718,7 @@
       <w:r>
         <w:drawing>
           <wp:inline distT="0" distB="0" distL="0" distR="0">
-            <wp:extent cx="5759999" cy="3067316"/>
+            <wp:extent cx="5759999" cy="2071443"/>
             <wp:docPr id="1037" name="Imagen 37"/>
             <wp:cNvGraphicFramePr>
               <a:graphicFrameLocks noChangeAspect="1"/>
@@ -43758,7 +43739,7 @@
                   <pic:spPr>
                     <a:xfrm>
                       <a:off x="0" y="0"/>
-                      <a:ext cx="5759999" cy="3067316"/>
+                      <a:ext cx="5759999" cy="2071443"/>
                     </a:xfrm>
                     <a:prstGeom prst="rect">
                       <a:avLst/>
@@ -43786,7 +43767,26 @@
           <w:sz w:val="18"/>
           <w:szCs w:val="18"/>
         </w:rPr>
-        <w:t xml:space="preserve">Figura C.30. C4 TRG_BLOQUEA_BORRADO_RENTAL: rechaza el DELETE aunque no encuentre filas y deja pasar el UPDATE; siguen 16.044 arriendos.</w:t>
+        <w:t xml:space="preserve">Figura C.30. Error controlado de PR_SIMULA_PLAZO (ORA-20203) y miembro privado no visible (PLS-00302).</w:t>
+      </w:r>
+    </w:p>
+    <w:p>
+      <w:pPr>
+        <w:pStyle w:val="Heading3"/>
+        <w:keepNext w:val="1"/>
+        <w:spacing w:after="100" w:before="180" w:lineRule="auto"/>
+        <w:rPr/>
+      </w:pPr>
+      <w:r>
+        <w:rPr>
+          <w:rFonts w:ascii="Calibri" w:cs="Calibri" w:eastAsia="Calibri" w:hAnsi="Calibri"/>
+          <w:b w:val="1"/>
+          <w:bCs w:val="1"/>
+          <w:color w:val="2e5496"/>
+          <w:sz w:val="23"/>
+          <w:szCs w:val="23"/>
+        </w:rPr>
+        <w:t xml:space="preserve">C.4 Catalina: triggers</w:t>
       </w:r>
     </w:p>
     <w:p>
@@ -43799,7 +43799,7 @@
       <w:r>
         <w:drawing>
           <wp:inline distT="0" distB="0" distL="0" distR="0">
-            <wp:extent cx="5759999" cy="3365853"/>
+            <wp:extent cx="5759999" cy="3194999"/>
             <wp:docPr id="1038" name="Imagen 38"/>
             <wp:cNvGraphicFramePr>
               <a:graphicFrameLocks noChangeAspect="1"/>
@@ -43820,7 +43820,7 @@
                   <pic:spPr>
                     <a:xfrm>
                       <a:off x="0" y="0"/>
-                      <a:ext cx="5759999" cy="3365853"/>
+                      <a:ext cx="5759999" cy="3194999"/>
                     </a:xfrm>
                     <a:prstGeom prst="rect">
                       <a:avLst/>
@@ -43848,7 +43848,7 @@
           <w:sz w:val="18"/>
           <w:szCs w:val="18"/>
         </w:rPr>
-        <w:t xml:space="preserve">Figura C.31. C5 TRG_AUDITA_RENTAL y TRG_AUDITA_PAYMENT: una línea por sentencia y ninguna por el borrado que C4 rechazó.</w:t>
+        <w:t xml:space="preserve">Figura C.31. C1 TRG_VALIDA_PAGO_RENTAL: el pago sin arriendo se rechaza con ORA-20301 y el pago con arriendo entra; tras el ROLLBACK quedan 16.049 pagos.</w:t>
       </w:r>
     </w:p>
     <w:p>
@@ -43861,7 +43861,7 @@
       <w:r>
         <w:drawing>
           <wp:inline distT="0" distB="0" distL="0" distR="0">
-            <wp:extent cx="5759999" cy="4016686"/>
+            <wp:extent cx="5759999" cy="3067316"/>
             <wp:docPr id="1039" name="Imagen 39"/>
             <wp:cNvGraphicFramePr>
               <a:graphicFrameLocks noChangeAspect="1"/>
@@ -43882,7 +43882,7 @@
                   <pic:spPr>
                     <a:xfrm>
                       <a:off x="0" y="0"/>
-                      <a:ext cx="5759999" cy="4016686"/>
+                      <a:ext cx="5759999" cy="3067316"/>
                     </a:xfrm>
                     <a:prstGeom prst="rect">
                       <a:avLst/>
@@ -43910,7 +43910,7 @@
           <w:sz w:val="18"/>
           <w:szCs w:val="18"/>
         </w:rPr>
-        <w:t xml:space="preserve">Figura C.32. C3 TRG_VALIDA_ARRIENDO: el cliente activo arrienda, el inactivo se rechaza y el INSERT ... SELECT da ORA-04091.</w:t>
+        <w:t xml:space="preserve">Figura C.32. C4 TRG_BLOQUEA_BORRADO_RENTAL: rechaza el DELETE aunque no encuentre filas y deja pasar el UPDATE; siguen 16.044 arriendos.</w:t>
       </w:r>
     </w:p>
     <w:p>
@@ -43923,7 +43923,7 @@
       <w:r>
         <w:drawing>
           <wp:inline distT="0" distB="0" distL="0" distR="0">
-            <wp:extent cx="5759999" cy="3103051"/>
+            <wp:extent cx="5759999" cy="3365853"/>
             <wp:docPr id="1040" name="Imagen 40"/>
             <wp:cNvGraphicFramePr>
               <a:graphicFrameLocks noChangeAspect="1"/>
@@ -43944,6 +43944,130 @@
                   <pic:spPr>
                     <a:xfrm>
                       <a:off x="0" y="0"/>
+                      <a:ext cx="5759999" cy="3365853"/>
+                    </a:xfrm>
+                    <a:prstGeom prst="rect">
+                      <a:avLst/>
+                    </a:prstGeom>
+                  </pic:spPr>
+                </pic:pic>
+              </a:graphicData>
+            </a:graphic>
+          </wp:inline>
+        </w:drawing>
+      </w:r>
+    </w:p>
+    <w:p>
+      <w:pPr>
+        <w:spacing w:after="200" w:lineRule="auto"/>
+        <w:jc w:val="center"/>
+        <w:rPr/>
+      </w:pPr>
+      <w:r>
+        <w:rPr>
+          <w:rFonts w:ascii="Calibri" w:cs="Calibri" w:eastAsia="Calibri" w:hAnsi="Calibri"/>
+          <w:i w:val="1"/>
+          <w:iCs w:val="1"/>
+          <w:color w:val="595959"/>
+          <w:sz w:val="18"/>
+          <w:szCs w:val="18"/>
+        </w:rPr>
+        <w:t xml:space="preserve">Figura C.33. C5 TRG_AUDITA_RENTAL y TRG_AUDITA_PAYMENT: una línea por sentencia y ninguna por el borrado que C4 rechazó.</w:t>
+      </w:r>
+    </w:p>
+    <w:p>
+      <w:pPr>
+        <w:keepNext w:val="1"/>
+        <w:spacing w:before="120" w:after="60" w:lineRule="auto"/>
+        <w:jc w:val="center"/>
+        <w:rPr/>
+      </w:pPr>
+      <w:r>
+        <w:drawing>
+          <wp:inline distT="0" distB="0" distL="0" distR="0">
+            <wp:extent cx="5759999" cy="4016686"/>
+            <wp:docPr id="1041" name="Imagen 41"/>
+            <wp:cNvGraphicFramePr>
+              <a:graphicFrameLocks noChangeAspect="1"/>
+            </wp:cNvGraphicFramePr>
+            <a:graphic>
+              <a:graphicData uri="http://schemas.openxmlformats.org/drawingml/2006/picture">
+                <pic:pic>
+                  <pic:nvPicPr>
+                    <pic:cNvPr id="1041" name="imagen41.jpg"/>
+                    <pic:cNvPicPr/>
+                  </pic:nvPicPr>
+                  <pic:blipFill>
+                    <a:blip r:embed="rIdImg41"/>
+                    <a:stretch>
+                      <a:fillRect/>
+                    </a:stretch>
+                  </pic:blipFill>
+                  <pic:spPr>
+                    <a:xfrm>
+                      <a:off x="0" y="0"/>
+                      <a:ext cx="5759999" cy="4016686"/>
+                    </a:xfrm>
+                    <a:prstGeom prst="rect">
+                      <a:avLst/>
+                    </a:prstGeom>
+                  </pic:spPr>
+                </pic:pic>
+              </a:graphicData>
+            </a:graphic>
+          </wp:inline>
+        </w:drawing>
+      </w:r>
+    </w:p>
+    <w:p>
+      <w:pPr>
+        <w:spacing w:after="200" w:lineRule="auto"/>
+        <w:jc w:val="center"/>
+        <w:rPr/>
+      </w:pPr>
+      <w:r>
+        <w:rPr>
+          <w:rFonts w:ascii="Calibri" w:cs="Calibri" w:eastAsia="Calibri" w:hAnsi="Calibri"/>
+          <w:i w:val="1"/>
+          <w:iCs w:val="1"/>
+          <w:color w:val="595959"/>
+          <w:sz w:val="18"/>
+          <w:szCs w:val="18"/>
+        </w:rPr>
+        <w:t xml:space="preserve">Figura C.34. C3 TRG_VALIDA_ARRIENDO: el cliente activo arrienda, el inactivo se rechaza y el INSERT ... SELECT da ORA-04091.</w:t>
+      </w:r>
+    </w:p>
+    <w:p>
+      <w:pPr>
+        <w:keepNext w:val="1"/>
+        <w:spacing w:before="120" w:after="60" w:lineRule="auto"/>
+        <w:jc w:val="center"/>
+        <w:rPr/>
+      </w:pPr>
+      <w:r>
+        <w:drawing>
+          <wp:inline distT="0" distB="0" distL="0" distR="0">
+            <wp:extent cx="5759999" cy="3103051"/>
+            <wp:docPr id="1042" name="Imagen 42"/>
+            <wp:cNvGraphicFramePr>
+              <a:graphicFrameLocks noChangeAspect="1"/>
+            </wp:cNvGraphicFramePr>
+            <a:graphic>
+              <a:graphicData uri="http://schemas.openxmlformats.org/drawingml/2006/picture">
+                <pic:pic>
+                  <pic:nvPicPr>
+                    <pic:cNvPr id="1042" name="imagen42.jpg"/>
+                    <pic:cNvPicPr/>
+                  </pic:nvPicPr>
+                  <pic:blipFill>
+                    <a:blip r:embed="rIdImg42"/>
+                    <a:stretch>
+                      <a:fillRect/>
+                    </a:stretch>
+                  </pic:blipFill>
+                  <pic:spPr>
+                    <a:xfrm>
+                      <a:off x="0" y="0"/>
                       <a:ext cx="5759999" cy="3103051"/>
                     </a:xfrm>
                     <a:prstGeom prst="rect">
@@ -43972,7 +44096,7 @@
           <w:sz w:val="18"/>
           <w:szCs w:val="18"/>
         </w:rPr>
-        <w:t xml:space="preserve">Figura C.33. C2 TRG_TOPE_MULTA_DEVOLUCION: 171 días de atraso cobran 20,99 USD y la devolución a tiempo no crea pago.</w:t>
+        <w:t xml:space="preserve">Figura C.35. C2 TRG_TOPE_MULTA_DEVOLUCION: 171 días de atraso cobran 20,99 USD y la devolución a tiempo no crea pago.</w:t>
       </w:r>
     </w:p>
     <w:sectPr>

</xml_diff>